<commit_message>
docs: update resume content to reflect current skills and project details
</commit_message>
<xml_diff>
--- a/src/assets/resume/resume.docx
+++ b/src/assets/resume/resume.docx
@@ -241,7 +241,6 @@
         <w:t xml:space="preserve"> | </w:t>
       </w:r>
       <w:hyperlink r:id="rId9" w:history="1">
-        <w:proofErr w:type="spellStart"/>
         <w:r>
           <w:rPr>
             <w:rStyle w:val="Hyperlink"/>
@@ -255,7 +254,6 @@
           </w:rPr>
           <w:t>LeetCode</w:t>
         </w:r>
-        <w:proofErr w:type="spellEnd"/>
       </w:hyperlink>
     </w:p>
     <w:p>
@@ -324,50 +322,6 @@
     <w:p>
       <w:pPr>
         <w:spacing w:after="60" w:line="276" w:lineRule="auto"/>
-        <w:outlineLvl w:val="0"/>
-        <w:rPr>
-          <w:rFonts w:ascii="Aptos" w:eastAsia="Times New Roman" w:hAnsi="Aptos" w:cs="Times New Roman"/>
-          <w:color w:val="000000" w:themeColor="text1"/>
-          <w:kern w:val="36"/>
-          <w:sz w:val="21"/>
-          <w:szCs w:val="21"/>
-          <w:lang w:eastAsia="en-IN"/>
-          <w14:ligatures w14:val="none"/>
-        </w:rPr>
-      </w:pPr>
-      <w:r>
-        <w:rPr>
-          <w:rFonts w:ascii="Aptos" w:hAnsi="Aptos"/>
-          <w:color w:val="000000" w:themeColor="text1"/>
-          <w:sz w:val="21"/>
-          <w:szCs w:val="21"/>
-        </w:rPr>
-        <w:t xml:space="preserve">Self-taught Full-Stack Developer building modern web applications from frontend to backend. I focus on clean architecture, intuitive user experiences, and performance-driven software while continuously strengthening my problem-solving skills through real-world projects and 130+ </w:t>
-      </w:r>
-      <w:proofErr w:type="spellStart"/>
-      <w:r>
-        <w:rPr>
-          <w:rFonts w:ascii="Aptos" w:hAnsi="Aptos"/>
-          <w:color w:val="000000" w:themeColor="text1"/>
-          <w:sz w:val="21"/>
-          <w:szCs w:val="21"/>
-        </w:rPr>
-        <w:t>LeetCode</w:t>
-      </w:r>
-      <w:proofErr w:type="spellEnd"/>
-      <w:r>
-        <w:rPr>
-          <w:rFonts w:ascii="Aptos" w:hAnsi="Aptos"/>
-          <w:color w:val="000000" w:themeColor="text1"/>
-          <w:sz w:val="21"/>
-          <w:szCs w:val="21"/>
-        </w:rPr>
-        <w:t xml:space="preserve"> problems.</w:t>
-      </w:r>
-    </w:p>
-    <w:p>
-      <w:pPr>
-        <w:spacing w:after="60" w:line="276" w:lineRule="auto"/>
         <w:rPr>
           <w:rFonts w:ascii="Aptos" w:eastAsia="Times New Roman" w:hAnsi="Aptos" w:cs="Times New Roman"/>
           <w:b/>
@@ -380,6 +334,18 @@
           <w14:ligatures w14:val="none"/>
         </w:rPr>
       </w:pPr>
+      <w:r>
+        <w:rPr>
+          <w:rFonts w:ascii="Aptos" w:eastAsia="Times New Roman" w:hAnsi="Aptos" w:cs="Times New Roman"/>
+          <w:color w:val="000000" w:themeColor="text1"/>
+          <w:kern w:val="0"/>
+          <w:sz w:val="21"/>
+          <w:szCs w:val="21"/>
+          <w:lang w:eastAsia="en-IN"/>
+          <w14:ligatures w14:val="none"/>
+        </w:rPr>
+        <w:t>Self-taught Full-Stack Developer building web applications with React, Node.js, Express, and MongoDB. I enjoy working across the stack, from backend APIs and databases to frontend interfaces, while continuously improving through real-world projects and 130+ LeetCode problems.</w:t>
+      </w:r>
       <w:r>
         <w:rPr>
           <w:rFonts w:ascii="Aptos" w:eastAsia="Times New Roman" w:hAnsi="Aptos" w:cs="Times New Roman"/>
@@ -636,7 +602,7 @@
           <w:lang w:eastAsia="en-IN"/>
           <w14:ligatures w14:val="none"/>
         </w:rPr>
-        <w:t xml:space="preserve">Engineered the complete commerce workflow by integrating product discovery, cart management, checkout, shipping, payment, stock validation, and order lifecycle management into a consistent purchasing experience. </w:t>
+        <w:t>Implemented the complete shopping workflow, including product discovery, cart management, checkout, shipping, payment, stock validation, and order management.</w:t>
       </w:r>
     </w:p>
     <w:p>
@@ -698,33 +664,7 @@
           <w:lang w:eastAsia="en-IN"/>
           <w14:ligatures w14:val="none"/>
         </w:rPr>
-        <w:t xml:space="preserve">Optimized frontend performance through responsive image delivery, lazy loading, code splitting, and continuous Lighthouse-focused improvements before deploying the frontend on </w:t>
-      </w:r>
-      <w:proofErr w:type="spellStart"/>
-      <w:r>
-        <w:rPr>
-          <w:rFonts w:ascii="Aptos" w:eastAsia="Times New Roman" w:hAnsi="Aptos" w:cs="Times New Roman"/>
-          <w:color w:val="000000" w:themeColor="text1"/>
-          <w:kern w:val="0"/>
-          <w:sz w:val="21"/>
-          <w:szCs w:val="21"/>
-          <w:lang w:eastAsia="en-IN"/>
-          <w14:ligatures w14:val="none"/>
-        </w:rPr>
-        <w:t>Vercel</w:t>
-      </w:r>
-      <w:proofErr w:type="spellEnd"/>
-      <w:r>
-        <w:rPr>
-          <w:rFonts w:ascii="Aptos" w:eastAsia="Times New Roman" w:hAnsi="Aptos" w:cs="Times New Roman"/>
-          <w:color w:val="000000" w:themeColor="text1"/>
-          <w:kern w:val="0"/>
-          <w:sz w:val="21"/>
-          <w:szCs w:val="21"/>
-          <w:lang w:eastAsia="en-IN"/>
-          <w14:ligatures w14:val="none"/>
-        </w:rPr>
-        <w:t xml:space="preserve"> and backend on Railway with MongoDB Atlas. </w:t>
+        <w:t>Improved frontend performance through responsive image delivery, lazy loading, and code splitting, then deployed the frontend on Vercel and backend on Railway using MongoDB Atlas.</w:t>
       </w:r>
     </w:p>
     <w:p>
@@ -947,7 +887,7 @@
           <w:lang w:eastAsia="en-IN"/>
           <w14:ligatures w14:val="none"/>
         </w:rPr>
-        <w:t>Implemented accessibility, SEO, structured data, and performance optimizations to deliver a polished user experience.</w:t>
+        <w:t>Implemented accessibility improvements, SEO metadata, structured data, and performance optimizations.</w:t>
       </w:r>
     </w:p>
     <w:p>
@@ -1091,7 +1031,31 @@
           <w:lang w:eastAsia="en-IN"/>
           <w14:ligatures w14:val="none"/>
         </w:rPr>
-        <w:t>Backend: Node.js • Express.js • MongoDB • Mongoose • REST APIs • JWT Authentication • Multer • Resend</w:t>
+        <w:t>Backend: Node.js • Express.js • MongoDB • Mongoose • REST APIs • JWT Authenticatio</w:t>
+      </w:r>
+      <w:r>
+        <w:rPr>
+          <w:rFonts w:ascii="Aptos" w:eastAsia="Times New Roman" w:hAnsi="Aptos" w:cs="Times New Roman"/>
+          <w:color w:val="000000" w:themeColor="text1"/>
+          <w:kern w:val="0"/>
+          <w:sz w:val="21"/>
+          <w:szCs w:val="21"/>
+          <w:lang w:eastAsia="en-IN"/>
+          <w14:ligatures w14:val="none"/>
+        </w:rPr>
+        <w:t>n</w:t>
+      </w:r>
+      <w:r>
+        <w:rPr>
+          <w:rFonts w:ascii="Aptos" w:eastAsia="Times New Roman" w:hAnsi="Aptos" w:cs="Times New Roman"/>
+          <w:color w:val="000000" w:themeColor="text1"/>
+          <w:kern w:val="0"/>
+          <w:sz w:val="21"/>
+          <w:szCs w:val="21"/>
+          <w:lang w:eastAsia="en-IN"/>
+          <w14:ligatures w14:val="none"/>
+        </w:rPr>
+        <w:t xml:space="preserve"> • Multer • Resend</w:t>
       </w:r>
     </w:p>
     <w:p>
@@ -1118,22 +1082,8 @@
           <w:lang w:eastAsia="en-IN"/>
           <w14:ligatures w14:val="none"/>
         </w:rPr>
-        <w:t xml:space="preserve">Tools: Git • GitHub • Postman • MongoDB Atlas • Railway • </w:t>
-      </w:r>
-      <w:proofErr w:type="spellStart"/>
-      <w:r>
-        <w:rPr>
-          <w:rFonts w:ascii="Aptos" w:eastAsia="Times New Roman" w:hAnsi="Aptos" w:cs="Times New Roman"/>
-          <w:color w:val="000000" w:themeColor="text1"/>
-          <w:kern w:val="0"/>
-          <w:sz w:val="21"/>
-          <w:szCs w:val="21"/>
-          <w:lang w:eastAsia="en-IN"/>
-          <w14:ligatures w14:val="none"/>
-        </w:rPr>
-        <w:t>Vercel</w:t>
-      </w:r>
-      <w:proofErr w:type="spellEnd"/>
+        <w:t>Tools: Git • GitHub • Postman • MongoDB Atlas • Railway • Vercel</w:t>
+      </w:r>
       <w:r>
         <w:rPr>
           <w:rFonts w:ascii="Aptos" w:eastAsia="Times New Roman" w:hAnsi="Aptos" w:cs="Times New Roman"/>
@@ -2576,7 +2526,6 @@
   <w:style w:type="character" w:default="1" w:styleId="DefaultParagraphFont">
     <w:name w:val="Default Paragraph Font"/>
     <w:uiPriority w:val="1"/>
-    <w:semiHidden/>
     <w:unhideWhenUsed/>
   </w:style>
   <w:style w:type="table" w:default="1" w:styleId="TableNormal">

</xml_diff>